<commit_message>
CP week 7 updates
</commit_message>
<xml_diff>
--- a/06 Intro CP/Slides/Week 7/Figs/people.docx
+++ b/06 Intro CP/Slides/Week 7/Figs/people.docx
@@ -2,7 +2,14 @@
 <file path=word/document.xml><?xml version="1.0" encoding="utf-8"?>
 <w:document xmlns:wpc="http://schemas.microsoft.com/office/word/2010/wordprocessingCanvas" xmlns:cx="http://schemas.microsoft.com/office/drawing/2014/chartex" xmlns:cx1="http://schemas.microsoft.com/office/drawing/2015/9/8/chartex" xmlns:cx2="http://schemas.microsoft.com/office/drawing/2015/10/21/chartex" xmlns:cx3="http://schemas.microsoft.com/office/drawing/2016/5/9/chartex" xmlns:cx4="http://schemas.microsoft.com/office/drawing/2016/5/10/chartex" xmlns:cx5="http://schemas.microsoft.com/office/drawing/2016/5/11/chartex" xmlns:cx6="http://schemas.microsoft.com/office/drawing/2016/5/12/chartex" xmlns:cx7="http://schemas.microsoft.com/office/drawing/2016/5/13/chartex" xmlns:cx8="http://schemas.microsoft.com/office/drawing/2016/5/14/chartex" xmlns:mc="http://schemas.openxmlformats.org/markup-compatibility/2006" xmlns:aink="http://schemas.microsoft.com/office/drawing/2016/ink" xmlns:am3d="http://schemas.microsoft.com/office/drawing/2017/model3d" xmlns:o="urn:schemas-microsoft-com:office:office" xmlns:oel="http://schemas.microsoft.com/office/2019/extlst" xmlns:r="http://schemas.openxmlformats.org/officeDocument/2006/relationships" xmlns:m="http://schemas.openxmlformats.org/officeDocument/2006/math" xmlns:v="urn:schemas-microsoft-com:vml" xmlns:wp14="http://schemas.microsoft.com/office/word/2010/wordprocessingDrawing" xmlns:wp="http://schemas.openxmlformats.org/drawingml/2006/wordprocessingDrawing" xmlns:w10="urn:schemas-microsoft-com:office:word" xmlns:w="http://schemas.openxmlformats.org/wordprocessingml/2006/main" xmlns:w14="http://schemas.microsoft.com/office/word/2010/wordml" xmlns:w15="http://schemas.microsoft.com/office/word/2012/wordml" xmlns:w16cex="http://schemas.microsoft.com/office/word/2018/wordml/cex" xmlns:w16cid="http://schemas.microsoft.com/office/word/2016/wordml/cid" xmlns:w16="http://schemas.microsoft.com/office/word/2018/wordml" xmlns:w16du="http://schemas.microsoft.com/office/word/2023/wordml/word16du" xmlns:w16sdtdh="http://schemas.microsoft.com/office/word/2020/wordml/sdtdatahash" xmlns:w16sdtfl="http://schemas.microsoft.com/office/word/2024/wordml/sdtformatlock" xmlns:w16se="http://schemas.microsoft.com/office/word/2015/wordml/symex" xmlns:wpg="http://schemas.microsoft.com/office/word/2010/wordprocessingGroup" xmlns:wpi="http://schemas.microsoft.com/office/word/2010/wordprocessingInk" xmlns:wne="http://schemas.microsoft.com/office/word/2006/wordml" xmlns:wps="http://schemas.microsoft.com/office/word/2010/wordprocessingShape" mc:Ignorable="w14 w15 w16se w16cid w16 w16cex w16sdtdh w16sdtfl w16du wp14">
   <w:body>
-    <w:p/>
+    <w:p>
+      <w:pPr>
+        <w:rPr>
+          <w:rFonts w:eastAsia="PMingLiU" w:hint="eastAsia"/>
+          <w:lang w:eastAsia="zh-TW"/>
+        </w:rPr>
+      </w:pPr>
+    </w:p>
     <w:tbl>
       <w:tblPr>
         <w:tblStyle w:val="ae"/>
@@ -102,10 +109,11 @@
             <w:pPr>
               <w:jc w:val="center"/>
               <w:rPr>
-                <w:rFonts w:ascii="Arial" w:hAnsi="Arial" w:cs="Arial"/>
+                <w:rFonts w:ascii="Arial" w:eastAsia="PMingLiU" w:hAnsi="Arial" w:cs="Arial"/>
                 <w:b/>
                 <w:bCs/>
                 <w:noProof/>
+                <w:lang w:eastAsia="zh-TW"/>
               </w:rPr>
             </w:pPr>
             <w:r>
@@ -115,26 +123,20 @@
                 <w:bCs/>
                 <w:noProof/>
               </w:rPr>
-              <w:t>People’s Parties (</w:t>
+              <w:t>People’s Parties (Partido Popular)</w:t>
             </w:r>
-            <w:r>
-              <w:rPr>
-                <w:rFonts w:ascii="Arial" w:hAnsi="Arial" w:cs="Arial"/>
+          </w:p>
+          <w:p>
+            <w:pPr>
+              <w:jc w:val="center"/>
+              <w:rPr>
+                <w:rFonts w:ascii="Arial" w:eastAsia="PMingLiU" w:hAnsi="Arial" w:cs="Arial" w:hint="eastAsia"/>
                 <w:b/>
                 <w:bCs/>
                 <w:noProof/>
-              </w:rPr>
-              <w:t>Partido Popular</w:t>
-            </w:r>
-            <w:r>
-              <w:rPr>
-                <w:rFonts w:ascii="Arial" w:hAnsi="Arial" w:cs="Arial"/>
-                <w:b/>
-                <w:bCs/>
-                <w:noProof/>
-              </w:rPr>
-              <w:t>)</w:t>
-            </w:r>
+                <w:lang w:eastAsia="zh-TW"/>
+              </w:rPr>
+            </w:pPr>
           </w:p>
         </w:tc>
         <w:tc>
@@ -400,9 +402,10 @@
             <w:pPr>
               <w:jc w:val="center"/>
               <w:rPr>
-                <w:rFonts w:ascii="Arial" w:hAnsi="Arial" w:cs="Arial"/>
-                <w:b/>
-                <w:bCs/>
+                <w:rFonts w:ascii="Arial" w:eastAsia="PMingLiU" w:hAnsi="Arial" w:cs="Arial"/>
+                <w:b/>
+                <w:bCs/>
+                <w:lang w:eastAsia="zh-TW"/>
               </w:rPr>
             </w:pPr>
             <w:r>
@@ -413,6 +416,17 @@
               </w:rPr>
               <w:t>Swiss People’s Party</w:t>
             </w:r>
+          </w:p>
+          <w:p>
+            <w:pPr>
+              <w:jc w:val="center"/>
+              <w:rPr>
+                <w:rFonts w:ascii="Arial" w:eastAsia="PMingLiU" w:hAnsi="Arial" w:cs="Arial" w:hint="eastAsia"/>
+                <w:b/>
+                <w:bCs/>
+                <w:lang w:eastAsia="zh-TW"/>
+              </w:rPr>
+            </w:pPr>
           </w:p>
         </w:tc>
         <w:tc>
@@ -619,7 +633,7 @@
                 <w:noProof/>
               </w:rPr>
               <w:drawing>
-                <wp:inline distT="0" distB="0" distL="0" distR="0" wp14:anchorId="73861959" wp14:editId="2A99D6DA">
+                <wp:inline distT="0" distB="0" distL="0" distR="0" wp14:anchorId="73861959" wp14:editId="42370D54">
                   <wp:extent cx="1440000" cy="1440000"/>
                   <wp:effectExtent l="0" t="0" r="8255" b="8255"/>
                   <wp:docPr id="373467674" name="图片 5"/>
@@ -693,31 +707,7 @@
                 <w:b/>
                 <w:bCs/>
               </w:rPr>
-              <w:t xml:space="preserve"> Belang</w:t>
-            </w:r>
-            <w:r>
-              <w:rPr>
-                <w:rFonts w:ascii="Arial" w:hAnsi="Arial" w:cs="Arial"/>
-                <w:b/>
-                <w:bCs/>
-              </w:rPr>
-              <w:t xml:space="preserve"> (</w:t>
-            </w:r>
-            <w:r>
-              <w:rPr>
-                <w:rFonts w:ascii="Arial" w:hAnsi="Arial" w:cs="Arial"/>
-                <w:b/>
-                <w:bCs/>
-              </w:rPr>
-              <w:t>Flemish Interest</w:t>
-            </w:r>
-            <w:r>
-              <w:rPr>
-                <w:rFonts w:ascii="Arial" w:hAnsi="Arial" w:cs="Arial"/>
-                <w:b/>
-                <w:bCs/>
-              </w:rPr>
-              <w:t>)</w:t>
+              <w:t xml:space="preserve"> Belang (Flemish Interest)</w:t>
             </w:r>
           </w:p>
         </w:tc>
@@ -901,13 +891,7 @@
         </w:tc>
       </w:tr>
     </w:tbl>
-    <w:p>
-      <w:pPr>
-        <w:rPr>
-          <w:rFonts w:hint="eastAsia"/>
-        </w:rPr>
-      </w:pPr>
-    </w:p>
+    <w:p/>
     <w:sectPr>
       <w:pgSz w:w="16838" w:h="11906" w:orient="landscape"/>
       <w:pgMar w:top="1134" w:right="1134" w:bottom="1134" w:left="1134" w:header="851" w:footer="992" w:gutter="0"/>
@@ -1520,6 +1504,7 @@
   <w:style w:type="character" w:default="1" w:styleId="a0">
     <w:name w:val="Default Paragraph Font"/>
     <w:uiPriority w:val="1"/>
+    <w:semiHidden/>
     <w:unhideWhenUsed/>
   </w:style>
   <w:style w:type="table" w:default="1" w:styleId="a1">

</xml_diff>